<commit_message>
Add Magcamit Research Assistant entry to CV
Added Jul–Sept 2025 Research Assistant position (Dr. Michael Magcamit,
Division of Psychology and Mental Health, UoM) — systematic literature
review on emotion regulation and cognitive reappraisal for ERC and
Leverhulme Trust grant applications.

Co-Authored-By: Claude Sonnet 4.6 <noreply@anthropic.com>
</commit_message>
<xml_diff>
--- a/CV_Yuhui Chen.docx
+++ b/CV_Yuhui Chen.docx
@@ -3568,6 +3568,88 @@
           <w:bCs/>
           <w:sz w:val="20"/>
         </w:rPr>
+        <w:t>Jul. 2025 – Sept. 2025</w:t>
+      </w:r>
+      <w:r>
+        <w:rPr>
+          <w:rFonts w:ascii="Times New Roman" w:hAnsi="Times New Roman"/>
+          <w:bCs/>
+          <w:sz w:val="20"/>
+        </w:rPr>
+        <w:tab/>
+      </w:r>
+      <w:r>
+        <w:rPr>
+          <w:rFonts w:ascii="Times New Roman" w:hAnsi="Times New Roman"/>
+          <w:b/>
+          <w:sz w:val="20"/>
+        </w:rPr>
+        <w:t>Research Assistant, University of Manchester</w:t>
+      </w:r>
+    </w:p>
+    <w:p>
+      <w:pPr>
+        <w:spacing w:line="276" w:lineRule="auto"/>
+        <w:ind w:left="2160"/>
+        <w:rPr>
+          <w:rFonts w:ascii="Times New Roman" w:hAnsi="Times New Roman"/>
+          <w:bCs/>
+          <w:sz w:val="20"/>
+        </w:rPr>
+      </w:pPr>
+      <w:r>
+        <w:rPr>
+          <w:rFonts w:ascii="Times New Roman" w:hAnsi="Times New Roman"/>
+          <w:bCs/>
+          <w:sz w:val="20"/>
+        </w:rPr>
+        <w:t>Supervisor: Dr. Michael Magcamit, Division of Psychology and Mental Health</w:t>
+      </w:r>
+    </w:p>
+    <w:p>
+      <w:pPr>
+        <w:spacing w:line="276" w:lineRule="auto"/>
+        <w:ind w:left="2160"/>
+        <w:rPr>
+          <w:rFonts w:ascii="Times New Roman" w:hAnsi="Times New Roman"/>
+          <w:bCs/>
+          <w:sz w:val="20"/>
+        </w:rPr>
+      </w:pPr>
+      <w:r>
+        <w:rPr>
+          <w:rFonts w:ascii="Times New Roman" w:hAnsi="Times New Roman"/>
+          <w:bCs/>
+          <w:sz w:val="20"/>
+        </w:rPr>
+        <w:t>Conducted a systematic literature review on emotion regulation and cognitive reappraisal in support of ERC and Leverhulme Trust grant applications (80-hour commissioned post, £1,800).</w:t>
+      </w:r>
+    </w:p>
+    <w:p>
+      <w:pPr>
+        <w:spacing w:line="276" w:lineRule="auto"/>
+        <w:rPr>
+          <w:rFonts w:ascii="Times New Roman" w:hAnsi="Times New Roman"/>
+          <w:b/>
+          <w:sz w:val="20"/>
+        </w:rPr>
+      </w:pPr>
+    </w:p>
+    <w:p>
+      <w:pPr>
+        <w:spacing w:line="276" w:lineRule="auto"/>
+        <w:rPr>
+          <w:rFonts w:ascii="Times New Roman" w:hAnsi="Times New Roman"/>
+          <w:b/>
+          <w:sz w:val="20"/>
+        </w:rPr>
+      </w:pPr>
+      <w:r>
+        <w:rPr>
+          <w:rFonts w:ascii="Times New Roman" w:hAnsi="Times New Roman"/>
+          <w:bCs/>
+          <w:sz w:val="20"/>
+        </w:rPr>
         <w:t>Mar. 2025 – Jun. 2025</w:t>
       </w:r>
       <w:r>
@@ -3603,24 +3685,7 @@
           <w:bCs/>
           <w:sz w:val="20"/>
         </w:rPr>
-        <w:t>Supervisor: Prof</w:t>
-      </w:r>
-      <w:r>
-        <w:rPr>
-          <w:rFonts w:ascii="Times New Roman" w:hAnsi="Times New Roman" w:hint="eastAsia"/>
-          <w:bCs/>
-          <w:sz w:val="20"/>
-          <w:lang w:eastAsia="zh-CN"/>
-        </w:rPr>
-        <w:t xml:space="preserve">. </w:t>
-      </w:r>
-      <w:r>
-        <w:rPr>
-          <w:rFonts w:ascii="Times New Roman" w:hAnsi="Times New Roman"/>
-          <w:bCs/>
-          <w:sz w:val="20"/>
-        </w:rPr>
-        <w:t>Antonio Zuffiano</w:t>
+        <w:t>Supervisor: Professor Antonio Zuffiano</w:t>
       </w:r>
     </w:p>
     <w:p>
@@ -3639,24 +3704,7 @@
           <w:bCs/>
           <w:sz w:val="20"/>
         </w:rPr>
-        <w:t xml:space="preserve">Investigated </w:t>
-      </w:r>
-      <w:r>
-        <w:rPr>
-          <w:rFonts w:ascii="Times New Roman" w:hAnsi="Times New Roman" w:hint="eastAsia"/>
-          <w:bCs/>
-          <w:sz w:val="20"/>
-          <w:lang w:eastAsia="zh-CN"/>
-        </w:rPr>
-        <w:t>tri-factor model to understand prosocial behaviours and wellbeing</w:t>
-      </w:r>
-      <w:r>
-        <w:rPr>
-          <w:rFonts w:ascii="Times New Roman" w:hAnsi="Times New Roman"/>
-          <w:bCs/>
-          <w:sz w:val="20"/>
-        </w:rPr>
-        <w:t>; funded by the UK Government Turing Scheme (£1,400).</w:t>
+        <w:t>Investigated prosocial behaviours and informant discrepancy methodologies; funded by the UK Government Turing Scheme (£1,400).</w:t>
       </w:r>
     </w:p>
     <w:p>
@@ -3729,24 +3777,7 @@
           <w:bCs/>
           <w:sz w:val="20"/>
         </w:rPr>
-        <w:t>Collaborator: Prof</w:t>
-      </w:r>
-      <w:r>
-        <w:rPr>
-          <w:rFonts w:ascii="Times New Roman" w:hAnsi="Times New Roman" w:hint="eastAsia"/>
-          <w:bCs/>
-          <w:sz w:val="20"/>
-          <w:lang w:eastAsia="zh-CN"/>
-        </w:rPr>
-        <w:t>.</w:t>
-      </w:r>
-      <w:r>
-        <w:rPr>
-          <w:rFonts w:ascii="Times New Roman" w:hAnsi="Times New Roman"/>
-          <w:bCs/>
-          <w:sz w:val="20"/>
-        </w:rPr>
-        <w:t xml:space="preserve"> Katja Upadyaya, University of Helsinki</w:t>
+        <w:t>Collaborator: Professor Katja Upadyaya, University of Helsinki</w:t>
       </w:r>
     </w:p>
     <w:p>
@@ -4931,6 +4962,7 @@
           <w:bCs/>
           <w:sz w:val="20"/>
         </w:rPr>
+        <w:lastRenderedPageBreak/>
         <w:t>Led the recruitment process, successfully enlisting</w:t>
       </w:r>
       <w:r>
@@ -5081,7 +5113,6 @@
           <w:sz w:val="20"/>
           <w:u w:val="single"/>
         </w:rPr>
-        <w:lastRenderedPageBreak/>
         <w:t xml:space="preserve">Project 3: </w:t>
       </w:r>
       <w:r>
@@ -6462,6 +6493,7 @@
           <w:rFonts w:ascii="Times New Roman" w:hAnsi="Times New Roman"/>
           <w:sz w:val="20"/>
         </w:rPr>
+        <w:lastRenderedPageBreak/>
         <w:t>Programming: R</w:t>
       </w:r>
       <w:r>
@@ -6652,7 +6684,6 @@
           <w:sz w:val="20"/>
           <w:u w:val="none"/>
         </w:rPr>
-        <w:lastRenderedPageBreak/>
         <w:t>Division of Human Communication, Development &amp; Hearing</w:t>
       </w:r>
     </w:p>

</xml_diff>

<commit_message>
Add ISSID 2027 Scientific Committee: news item + CV professional service section
</commit_message>
<xml_diff>
--- a/CV_Yuhui Chen.docx
+++ b/CV_Yuhui Chen.docx
@@ -623,8 +623,6 @@
           <w:sz w:val="20"/>
         </w:rPr>
       </w:pPr>
-      <w:proofErr w:type="spellStart"/>
-      <w:proofErr w:type="gramStart"/>
       <w:r>
         <w:rPr>
           <w:rFonts w:ascii="Times New Roman" w:hAnsi="Times New Roman"/>
@@ -648,17 +646,7 @@
           <w:b/>
           <w:sz w:val="20"/>
         </w:rPr>
-        <w:t>Sc</w:t>
-      </w:r>
-      <w:proofErr w:type="spellEnd"/>
-      <w:proofErr w:type="gramEnd"/>
-      <w:r>
-        <w:rPr>
-          <w:rFonts w:ascii="Times New Roman" w:hAnsi="Times New Roman"/>
-          <w:b/>
-          <w:sz w:val="20"/>
-        </w:rPr>
-        <w:t xml:space="preserve"> Psychology (Hons)</w:t>
+        <w:t>Sc Psychology (Hons)</w:t>
       </w:r>
     </w:p>
     <w:p>
@@ -1056,7 +1044,7 @@
           <w:sz w:val="20"/>
           <w:lang w:eastAsia="zh-CN"/>
         </w:rPr>
-        <w:t>2025</w:t>
+        <w:t xml:space="preserve">2025</w:t>
       </w:r>
       <w:r>
         <w:rPr>
@@ -1083,6 +1071,26 @@
           <w:sz w:val="20"/>
           <w:lang w:eastAsia="zh-CN"/>
         </w:rPr>
+        <w:t xml:space="preserve">Turing Scheme Research Exchange Grant, UK Government</w:t>
+      </w:r>
+    </w:p>
+    <w:p>
+      <w:pPr>
+        <w:spacing w:line="276" w:lineRule="auto"/>
+        <w:rPr>
+          <w:rFonts w:ascii="Times New Roman" w:hAnsi="Times New Roman"/>
+          <w:bCs/>
+          <w:sz w:val="20"/>
+          <w:lang w:eastAsia="zh-CN"/>
+        </w:rPr>
+      </w:pPr>
+      <w:r>
+        <w:rPr>
+          <w:rFonts w:ascii="Times New Roman" w:hAnsi="Times New Roman"/>
+          <w:bCs/>
+          <w:sz w:val="20"/>
+          <w:lang w:eastAsia="zh-CN"/>
+        </w:rPr>
         <w:tab/>
       </w:r>
       <w:r>
@@ -1092,26 +1100,6 @@
           <w:sz w:val="20"/>
           <w:lang w:eastAsia="zh-CN"/>
         </w:rPr>
-        <w:t>Turing Scheme Research Exchange Grant, UK Government</w:t>
-      </w:r>
-    </w:p>
-    <w:p>
-      <w:pPr>
-        <w:spacing w:line="276" w:lineRule="auto"/>
-        <w:rPr>
-          <w:rFonts w:ascii="Times New Roman" w:hAnsi="Times New Roman"/>
-          <w:bCs/>
-          <w:sz w:val="20"/>
-          <w:lang w:eastAsia="zh-CN"/>
-        </w:rPr>
-      </w:pPr>
-      <w:r>
-        <w:rPr>
-          <w:rFonts w:ascii="Times New Roman" w:hAnsi="Times New Roman"/>
-          <w:bCs/>
-          <w:sz w:val="20"/>
-          <w:lang w:eastAsia="zh-CN"/>
-        </w:rPr>
         <w:tab/>
       </w:r>
       <w:r>
@@ -1130,8 +1118,7 @@
           <w:sz w:val="20"/>
           <w:lang w:eastAsia="zh-CN"/>
         </w:rPr>
-        <w:tab/>
-        <w:t>Amount: £1,400</w:t>
+        <w:t xml:space="preserve">Amount: £1,400</w:t>
       </w:r>
     </w:p>
     <w:p>
@@ -1645,23 +1632,7 @@
           <w:rFonts w:ascii="Times New Roman" w:hAnsi="Times New Roman"/>
           <w:sz w:val="20"/>
         </w:rPr>
-        <w:t xml:space="preserve">, </w:t>
-      </w:r>
-      <w:proofErr w:type="spellStart"/>
-      <w:r>
-        <w:rPr>
-          <w:rFonts w:ascii="Times New Roman" w:hAnsi="Times New Roman"/>
-          <w:sz w:val="20"/>
-        </w:rPr>
-        <w:t>Zuffianò</w:t>
-      </w:r>
-      <w:proofErr w:type="spellEnd"/>
-      <w:r>
-        <w:rPr>
-          <w:rFonts w:ascii="Times New Roman" w:hAnsi="Times New Roman"/>
-          <w:sz w:val="20"/>
-        </w:rPr>
-        <w:t>, A., Manfredi, L., Gregori, F., Elliott, R., &amp; López-Pérez, B. (2025). Daily-life benefits of extrinsic interpersonal emotion regulation: An ecological momentary assessment study of depression and healthy controls. </w:t>
+        <w:t>, Zuffianò, A., Manfredi, L., Gregori, F., Elliott, R., &amp; López-Pérez, B. (2025). Daily-life benefits of extrinsic interpersonal emotion regulation: An ecological momentary assessment study of depression and healthy controls. </w:t>
       </w:r>
       <w:r>
         <w:rPr>
@@ -1715,37 +1686,12 @@
           <w:sz w:val="20"/>
         </w:rPr>
       </w:pPr>
-      <w:proofErr w:type="spellStart"/>
-      <w:r>
-        <w:rPr>
-          <w:rFonts w:ascii="Times New Roman" w:hAnsi="Times New Roman"/>
-          <w:sz w:val="20"/>
-        </w:rPr>
-        <w:t>Polias</w:t>
-      </w:r>
-      <w:proofErr w:type="spellEnd"/>
-      <w:r>
-        <w:rPr>
-          <w:rFonts w:ascii="Times New Roman" w:hAnsi="Times New Roman"/>
-          <w:sz w:val="20"/>
-        </w:rPr>
-        <w:t xml:space="preserve">, S., </w:t>
-      </w:r>
-      <w:proofErr w:type="spellStart"/>
-      <w:r>
-        <w:rPr>
-          <w:rFonts w:ascii="Times New Roman" w:hAnsi="Times New Roman"/>
-          <w:sz w:val="20"/>
-        </w:rPr>
-        <w:t>Zuffianò</w:t>
-      </w:r>
-      <w:proofErr w:type="spellEnd"/>
-      <w:r>
-        <w:rPr>
-          <w:rFonts w:ascii="Times New Roman" w:hAnsi="Times New Roman"/>
-          <w:sz w:val="20"/>
-        </w:rPr>
-        <w:t>, A., Chen, Y., Manfredi, L., Gregori, F., Bourke, L., &amp; López-Pérez, B. (2025). I want you to feel bad: Understanding the role of anger in extrinsic interpersonal affect worsening with ecological momentary assessment. </w:t>
+      <w:r>
+        <w:rPr>
+          <w:rFonts w:ascii="Times New Roman" w:hAnsi="Times New Roman"/>
+          <w:sz w:val="20"/>
+        </w:rPr>
+        <w:t>Polias, S., Zuffianò, A., Chen, Y., Manfredi, L., Gregori, F., Bourke, L., &amp; López-Pérez, B. (2025). I want you to feel bad: Understanding the role of anger in extrinsic interpersonal affect worsening with ecological momentary assessment. </w:t>
       </w:r>
       <w:r>
         <w:rPr>
@@ -1804,7 +1750,6 @@
           <w:rFonts w:ascii="Times New Roman" w:hAnsi="Times New Roman"/>
           <w:sz w:val="20"/>
         </w:rPr>
-        <w:lastRenderedPageBreak/>
         <w:t xml:space="preserve">López-Pérez, B., </w:t>
       </w:r>
       <w:r>
@@ -1821,23 +1766,7 @@
           <w:rFonts w:ascii="Times New Roman" w:hAnsi="Times New Roman"/>
           <w:sz w:val="20"/>
         </w:rPr>
-        <w:t xml:space="preserve">, Li, X., Cheng, S., &amp; Razavi, P. (2025). Exploring the Potential of Large Language Models to Understand Interpersonal Emotion Regulation Strategies </w:t>
-      </w:r>
-      <w:proofErr w:type="gramStart"/>
-      <w:r>
-        <w:rPr>
-          <w:rFonts w:ascii="Times New Roman" w:hAnsi="Times New Roman"/>
-          <w:sz w:val="20"/>
-        </w:rPr>
-        <w:t>From</w:t>
-      </w:r>
-      <w:proofErr w:type="gramEnd"/>
-      <w:r>
-        <w:rPr>
-          <w:rFonts w:ascii="Times New Roman" w:hAnsi="Times New Roman"/>
-          <w:sz w:val="20"/>
-        </w:rPr>
-        <w:t xml:space="preserve"> Narratives. </w:t>
+        <w:t>, Li, X., Cheng, S., &amp; Razavi, P. (2025). Exploring the Potential of Large Language Models to Understand Interpersonal Emotion Regulation Strategies From Narratives. </w:t>
       </w:r>
       <w:r>
         <w:rPr>
@@ -1921,6 +1850,7 @@
           <w:rFonts w:ascii="Times New Roman" w:hAnsi="Times New Roman"/>
           <w:sz w:val="20"/>
         </w:rPr>
+        <w:lastRenderedPageBreak/>
         <w:t xml:space="preserve">López-Pérez, B., Kwon, K., &amp; </w:t>
       </w:r>
       <w:r>
@@ -2032,29 +1962,7 @@
           <w:iCs/>
           <w:sz w:val="20"/>
         </w:rPr>
-        <w:t xml:space="preserve">Journal of </w:t>
-      </w:r>
-      <w:proofErr w:type="spellStart"/>
-      <w:r>
-        <w:rPr>
-          <w:rFonts w:ascii="Times New Roman" w:hAnsi="Times New Roman"/>
-          <w:bCs/>
-          <w:i/>
-          <w:iCs/>
-          <w:sz w:val="20"/>
-        </w:rPr>
-        <w:t>Pediatric</w:t>
-      </w:r>
-      <w:proofErr w:type="spellEnd"/>
-      <w:r>
-        <w:rPr>
-          <w:rFonts w:ascii="Times New Roman" w:hAnsi="Times New Roman"/>
-          <w:bCs/>
-          <w:i/>
-          <w:iCs/>
-          <w:sz w:val="20"/>
-        </w:rPr>
-        <w:t xml:space="preserve"> Nursing</w:t>
+        <w:t>Journal of Pediatric Nursing</w:t>
       </w:r>
       <w:r>
         <w:rPr>
@@ -2174,79 +2082,7 @@
           <w:bCs/>
           <w:sz w:val="20"/>
         </w:rPr>
-        <w:t xml:space="preserve">Hood, A. M., Kölbel, M., Stotesbury, H., </w:t>
-      </w:r>
-      <w:proofErr w:type="spellStart"/>
-      <w:r>
-        <w:rPr>
-          <w:rFonts w:ascii="Times New Roman" w:hAnsi="Times New Roman"/>
-          <w:bCs/>
-          <w:sz w:val="20"/>
-        </w:rPr>
-        <w:t>Kawadler</w:t>
-      </w:r>
-      <w:proofErr w:type="spellEnd"/>
-      <w:r>
-        <w:rPr>
-          <w:rFonts w:ascii="Times New Roman" w:hAnsi="Times New Roman"/>
-          <w:bCs/>
-          <w:sz w:val="20"/>
-        </w:rPr>
-        <w:t xml:space="preserve">, J., Slee, A., Inusa, B., </w:t>
-      </w:r>
-      <w:proofErr w:type="spellStart"/>
-      <w:r>
-        <w:rPr>
-          <w:rFonts w:ascii="Times New Roman" w:hAnsi="Times New Roman"/>
-          <w:bCs/>
-          <w:sz w:val="20"/>
-        </w:rPr>
-        <w:t>Pelidis</w:t>
-      </w:r>
-      <w:proofErr w:type="spellEnd"/>
-      <w:r>
-        <w:rPr>
-          <w:rFonts w:ascii="Times New Roman" w:hAnsi="Times New Roman"/>
-          <w:bCs/>
-          <w:sz w:val="20"/>
-        </w:rPr>
-        <w:t xml:space="preserve">, M., Howard, J., Chakravorty, S., Height, S., </w:t>
-      </w:r>
-      <w:proofErr w:type="spellStart"/>
-      <w:r>
-        <w:rPr>
-          <w:rFonts w:ascii="Times New Roman" w:hAnsi="Times New Roman"/>
-          <w:bCs/>
-          <w:sz w:val="20"/>
-        </w:rPr>
-        <w:t>Awogbade</w:t>
-      </w:r>
-      <w:proofErr w:type="spellEnd"/>
-      <w:r>
-        <w:rPr>
-          <w:rFonts w:ascii="Times New Roman" w:hAnsi="Times New Roman"/>
-          <w:bCs/>
-          <w:sz w:val="20"/>
-        </w:rPr>
-        <w:t xml:space="preserve">, M., Kirkham F. J., &amp; </w:t>
-      </w:r>
-      <w:proofErr w:type="spellStart"/>
-      <w:r>
-        <w:rPr>
-          <w:rFonts w:ascii="Times New Roman" w:hAnsi="Times New Roman"/>
-          <w:bCs/>
-          <w:sz w:val="20"/>
-        </w:rPr>
-        <w:t>Liossi</w:t>
-      </w:r>
-      <w:proofErr w:type="spellEnd"/>
-      <w:r>
-        <w:rPr>
-          <w:rFonts w:ascii="Times New Roman" w:hAnsi="Times New Roman"/>
-          <w:bCs/>
-          <w:sz w:val="20"/>
-        </w:rPr>
-        <w:t xml:space="preserve"> C. Pain Burden Predicts Executive Function in </w:t>
+        <w:t xml:space="preserve">Hood, A. M., Kölbel, M., Stotesbury, H., Kawadler, J., Slee, A., Inusa, B., Pelidis, M., Howard, J., Chakravorty, S., Height, S., Awogbade, M., Kirkham F. J., &amp; Liossi C. Pain Burden Predicts Executive Function in </w:t>
       </w:r>
       <w:r>
         <w:rPr>
@@ -2265,7 +2101,6 @@
         </w:rPr>
         <w:t xml:space="preserve">Patients with Sickle Cell Disease. </w:t>
       </w:r>
-      <w:proofErr w:type="spellStart"/>
       <w:r>
         <w:rPr>
           <w:rFonts w:ascii="Times New Roman" w:hAnsi="Times New Roman"/>
@@ -2276,7 +2111,6 @@
         </w:rPr>
         <w:t>HemaSphere</w:t>
       </w:r>
-      <w:proofErr w:type="spellEnd"/>
       <w:r>
         <w:rPr>
           <w:rFonts w:ascii="Times New Roman" w:hAnsi="Times New Roman"/>
@@ -3349,7 +3183,6 @@
           <w:bCs/>
           <w:sz w:val="20"/>
         </w:rPr>
-        <w:lastRenderedPageBreak/>
         <w:t xml:space="preserve">Chen, Y., </w:t>
       </w:r>
       <w:r>
@@ -3447,23 +3280,13 @@
         </w:rPr>
         <w:t xml:space="preserve">, </w:t>
       </w:r>
-      <w:proofErr w:type="spellStart"/>
-      <w:r>
-        <w:rPr>
-          <w:rFonts w:ascii="Times New Roman" w:hAnsi="Times New Roman"/>
-          <w:bCs/>
-          <w:sz w:val="20"/>
-        </w:rPr>
-        <w:t>Nagington</w:t>
-      </w:r>
-      <w:proofErr w:type="spellEnd"/>
-      <w:r>
-        <w:rPr>
-          <w:rFonts w:ascii="Times New Roman" w:hAnsi="Times New Roman"/>
-          <w:bCs/>
-          <w:sz w:val="20"/>
-        </w:rPr>
-        <w:t xml:space="preserve">, M., &amp; Muir, J. </w:t>
+      <w:r>
+        <w:rPr>
+          <w:rFonts w:ascii="Times New Roman" w:hAnsi="Times New Roman"/>
+          <w:bCs/>
+          <w:sz w:val="20"/>
+        </w:rPr>
+        <w:t xml:space="preserve">Nagington, M., &amp; Muir, J. </w:t>
       </w:r>
       <w:r>
         <w:rPr>
@@ -3524,6 +3347,7 @@
           <w:b/>
           <w:sz w:val="20"/>
         </w:rPr>
+        <w:lastRenderedPageBreak/>
         <w:t>RE</w:t>
       </w:r>
       <w:r>
@@ -3568,7 +3392,7 @@
           <w:bCs/>
           <w:sz w:val="20"/>
         </w:rPr>
-        <w:t>Jul. 2025 – Sept. 2025</w:t>
+        <w:t xml:space="preserve">Jul. 2025 – Sept. 2025</w:t>
       </w:r>
       <w:r>
         <w:rPr>
@@ -3584,7 +3408,7 @@
           <w:b/>
           <w:sz w:val="20"/>
         </w:rPr>
-        <w:t>Research Assistant, University of Manchester</w:t>
+        <w:t xml:space="preserve">Research Assistant, University of Manchester</w:t>
       </w:r>
     </w:p>
     <w:p>
@@ -3603,7 +3427,7 @@
           <w:bCs/>
           <w:sz w:val="20"/>
         </w:rPr>
-        <w:t>Supervisor: Dr. Michael Magcamit, Division of Psychology and Mental Health</w:t>
+        <w:t xml:space="preserve">Supervisor: Dr. Michael Magcamit, Division of Psychology and Mental Health</w:t>
       </w:r>
     </w:p>
     <w:p>
@@ -3622,35 +3446,35 @@
           <w:bCs/>
           <w:sz w:val="20"/>
         </w:rPr>
-        <w:t>Conducted a systematic literature review on emotion regulation and cognitive reappraisal in support of ERC and Leverhulme Trust grant applications (80-hour commissioned post, £1,800).</w:t>
-      </w:r>
-    </w:p>
-    <w:p>
-      <w:pPr>
-        <w:spacing w:line="276" w:lineRule="auto"/>
-        <w:rPr>
-          <w:rFonts w:ascii="Times New Roman" w:hAnsi="Times New Roman"/>
-          <w:b/>
-          <w:sz w:val="20"/>
-        </w:rPr>
-      </w:pPr>
-    </w:p>
-    <w:p>
-      <w:pPr>
-        <w:spacing w:line="276" w:lineRule="auto"/>
-        <w:rPr>
-          <w:rFonts w:ascii="Times New Roman" w:hAnsi="Times New Roman"/>
-          <w:b/>
-          <w:sz w:val="20"/>
-        </w:rPr>
-      </w:pPr>
-      <w:r>
-        <w:rPr>
-          <w:rFonts w:ascii="Times New Roman" w:hAnsi="Times New Roman"/>
-          <w:bCs/>
-          <w:sz w:val="20"/>
-        </w:rPr>
-        <w:t>Mar. 2025 – Jun. 2025</w:t>
+        <w:t xml:space="preserve">Conducted a systematic literature review on emotion regulation and cognitive reappraisal in support of ERC and Leverhulme Trust grant applications (80-hour commissioned post, £1,800).</w:t>
+      </w:r>
+    </w:p>
+    <w:p>
+      <w:pPr>
+        <w:spacing w:line="276" w:lineRule="auto"/>
+        <w:rPr>
+          <w:rFonts w:ascii="Times New Roman" w:hAnsi="Times New Roman"/>
+          <w:b/>
+          <w:sz w:val="20"/>
+        </w:rPr>
+      </w:pPr>
+    </w:p>
+    <w:p>
+      <w:pPr>
+        <w:spacing w:line="276" w:lineRule="auto"/>
+        <w:rPr>
+          <w:rFonts w:ascii="Times New Roman" w:hAnsi="Times New Roman"/>
+          <w:b/>
+          <w:sz w:val="20"/>
+        </w:rPr>
+      </w:pPr>
+      <w:r>
+        <w:rPr>
+          <w:rFonts w:ascii="Times New Roman" w:hAnsi="Times New Roman"/>
+          <w:bCs/>
+          <w:sz w:val="20"/>
+        </w:rPr>
+        <w:t xml:space="preserve">Mar. 2025 – Jun. 2025</w:t>
       </w:r>
       <w:r>
         <w:rPr>
@@ -3666,7 +3490,7 @@
           <w:b/>
           <w:sz w:val="20"/>
         </w:rPr>
-        <w:t>Research Exchange, Sapienza University of Rome, Italy</w:t>
+        <w:t xml:space="preserve">Research Exchange, Sapienza University of Rome, Italy</w:t>
       </w:r>
     </w:p>
     <w:p>
@@ -3685,7 +3509,7 @@
           <w:bCs/>
           <w:sz w:val="20"/>
         </w:rPr>
-        <w:t>Supervisor: Professor Antonio Zuffiano</w:t>
+        <w:t xml:space="preserve">Supervisor: Professor Antonio Zuffiano</w:t>
       </w:r>
     </w:p>
     <w:p>
@@ -3704,46 +3528,36 @@
           <w:bCs/>
           <w:sz w:val="20"/>
         </w:rPr>
-        <w:t>Investigated prosocial behaviours and informant discrepancy methodologies; funded by the UK Government Turing Scheme (£1,400).</w:t>
-      </w:r>
-    </w:p>
-    <w:p>
-      <w:pPr>
-        <w:spacing w:line="276" w:lineRule="auto"/>
-        <w:rPr>
-          <w:rFonts w:ascii="Times New Roman" w:hAnsi="Times New Roman"/>
-          <w:b/>
-          <w:sz w:val="20"/>
-        </w:rPr>
-      </w:pPr>
-    </w:p>
-    <w:p>
-      <w:pPr>
-        <w:spacing w:line="276" w:lineRule="auto"/>
-        <w:rPr>
-          <w:rFonts w:ascii="Times New Roman" w:hAnsi="Times New Roman"/>
-          <w:b/>
-          <w:sz w:val="20"/>
-        </w:rPr>
-      </w:pPr>
-      <w:r>
-        <w:rPr>
-          <w:rFonts w:ascii="Times New Roman" w:hAnsi="Times New Roman"/>
-          <w:bCs/>
-          <w:sz w:val="20"/>
-        </w:rPr>
-        <w:t xml:space="preserve">Mar. 31 – Apr. 3, </w:t>
-      </w:r>
-      <w:proofErr w:type="gramStart"/>
-      <w:r>
-        <w:rPr>
-          <w:rFonts w:ascii="Times New Roman" w:hAnsi="Times New Roman"/>
-          <w:bCs/>
-          <w:sz w:val="20"/>
-        </w:rPr>
-        <w:t>2025</w:t>
-      </w:r>
-      <w:proofErr w:type="gramEnd"/>
+        <w:t xml:space="preserve">Investigated prosocial behaviours and informant discrepancy methodologies; funded by the UK Government Turing Scheme (£1,400).</w:t>
+      </w:r>
+    </w:p>
+    <w:p>
+      <w:pPr>
+        <w:spacing w:line="276" w:lineRule="auto"/>
+        <w:rPr>
+          <w:rFonts w:ascii="Times New Roman" w:hAnsi="Times New Roman"/>
+          <w:b/>
+          <w:sz w:val="20"/>
+        </w:rPr>
+      </w:pPr>
+    </w:p>
+    <w:p>
+      <w:pPr>
+        <w:spacing w:line="276" w:lineRule="auto"/>
+        <w:rPr>
+          <w:rFonts w:ascii="Times New Roman" w:hAnsi="Times New Roman"/>
+          <w:b/>
+          <w:sz w:val="20"/>
+        </w:rPr>
+      </w:pPr>
+      <w:r>
+        <w:rPr>
+          <w:rFonts w:ascii="Times New Roman" w:hAnsi="Times New Roman"/>
+          <w:bCs/>
+          <w:sz w:val="20"/>
+        </w:rPr>
+        <w:t xml:space="preserve">Mar. 31 – Apr. 3, 2025</w:t>
+      </w:r>
       <w:r>
         <w:rPr>
           <w:rFonts w:ascii="Times New Roman" w:hAnsi="Times New Roman"/>
@@ -3758,7 +3572,7 @@
           <w:b/>
           <w:sz w:val="20"/>
         </w:rPr>
-        <w:t>EADP Writing Week 2025, Porto, Portugal</w:t>
+        <w:t xml:space="preserve">EADP Writing Week 2025, Porto, Portugal</w:t>
       </w:r>
     </w:p>
     <w:p>
@@ -3777,7 +3591,7 @@
           <w:bCs/>
           <w:sz w:val="20"/>
         </w:rPr>
-        <w:t>Collaborator: Professor Katja Upadyaya, University of Helsinki</w:t>
+        <w:t xml:space="preserve">Collaborator: Professor Katja Upadyaya, University of Helsinki</w:t>
       </w:r>
     </w:p>
     <w:p>
@@ -3796,7 +3610,7 @@
           <w:bCs/>
           <w:sz w:val="20"/>
         </w:rPr>
-        <w:t>Competitively selected by the European Association of Developmental Psychology; developing an ongoing collaborative manuscript.</w:t>
+        <w:t xml:space="preserve">Competitively selected by the European Association of Developmental Psychology; developing an ongoing collaborative manuscript.</w:t>
       </w:r>
     </w:p>
     <w:p>
@@ -4110,23 +3924,13 @@
           <w:sz w:val="20"/>
         </w:rPr>
       </w:pPr>
-      <w:proofErr w:type="spellStart"/>
-      <w:r>
-        <w:rPr>
-          <w:rFonts w:ascii="Times New Roman" w:hAnsi="Times New Roman"/>
-          <w:bCs/>
-          <w:sz w:val="20"/>
-        </w:rPr>
-        <w:t>Analyzed</w:t>
-      </w:r>
-      <w:proofErr w:type="spellEnd"/>
-      <w:r>
-        <w:rPr>
-          <w:rFonts w:ascii="Times New Roman" w:hAnsi="Times New Roman"/>
-          <w:bCs/>
-          <w:sz w:val="20"/>
-        </w:rPr>
-        <w:t xml:space="preserve"> developmental trajectories of social functioning across socioeconomic contexts</w:t>
+      <w:r>
+        <w:rPr>
+          <w:rFonts w:ascii="Times New Roman" w:hAnsi="Times New Roman"/>
+          <w:bCs/>
+          <w:sz w:val="20"/>
+        </w:rPr>
+        <w:t>Analyzed developmental trajectories of social functioning across socioeconomic contexts</w:t>
       </w:r>
     </w:p>
     <w:p>
@@ -4815,7 +4619,6 @@
         </w:rPr>
         <w:t xml:space="preserve">dentified significant between-group differences using Latent Profile Analysis on </w:t>
       </w:r>
-      <w:proofErr w:type="spellStart"/>
       <w:r>
         <w:rPr>
           <w:rFonts w:ascii="Times New Roman" w:hAnsi="Times New Roman"/>
@@ -4824,7 +4627,6 @@
         </w:rPr>
         <w:t>MPlus</w:t>
       </w:r>
-      <w:proofErr w:type="spellEnd"/>
     </w:p>
     <w:p>
       <w:pPr>
@@ -4881,23 +4683,13 @@
           <w:sz w:val="20"/>
         </w:rPr>
       </w:pPr>
-      <w:proofErr w:type="spellStart"/>
-      <w:r>
-        <w:rPr>
-          <w:rFonts w:ascii="Times New Roman" w:hAnsi="Times New Roman"/>
-          <w:bCs/>
-          <w:sz w:val="20"/>
-        </w:rPr>
-        <w:t>Analyzed</w:t>
-      </w:r>
-      <w:proofErr w:type="spellEnd"/>
-      <w:r>
-        <w:rPr>
-          <w:rFonts w:ascii="Times New Roman" w:hAnsi="Times New Roman"/>
-          <w:bCs/>
-          <w:sz w:val="20"/>
-        </w:rPr>
-        <w:t xml:space="preserve"> how emotion regulation capabilities evolve across different cultural contexts</w:t>
+      <w:r>
+        <w:rPr>
+          <w:rFonts w:ascii="Times New Roman" w:hAnsi="Times New Roman"/>
+          <w:bCs/>
+          <w:sz w:val="20"/>
+        </w:rPr>
+        <w:t>Analyzed how emotion regulation capabilities evolve across different cultural contexts</w:t>
       </w:r>
       <w:r>
         <w:rPr>
@@ -4962,7 +4754,6 @@
           <w:bCs/>
           <w:sz w:val="20"/>
         </w:rPr>
-        <w:lastRenderedPageBreak/>
         <w:t>Led the recruitment process, successfully enlisting</w:t>
       </w:r>
       <w:r>
@@ -5279,25 +5070,7 @@
           <w:b/>
           <w:sz w:val="20"/>
         </w:rPr>
-        <w:t xml:space="preserve">Pain and Developmental Outcomes in </w:t>
-      </w:r>
-      <w:proofErr w:type="spellStart"/>
-      <w:r>
-        <w:rPr>
-          <w:rFonts w:ascii="Times New Roman" w:hAnsi="Times New Roman"/>
-          <w:b/>
-          <w:sz w:val="20"/>
-        </w:rPr>
-        <w:t>Pediatric</w:t>
-      </w:r>
-      <w:proofErr w:type="spellEnd"/>
-      <w:r>
-        <w:rPr>
-          <w:rFonts w:ascii="Times New Roman" w:hAnsi="Times New Roman"/>
-          <w:b/>
-          <w:sz w:val="20"/>
-        </w:rPr>
-        <w:t xml:space="preserve"> Sickle Cell Disease (SCD) </w:t>
+        <w:t xml:space="preserve">Pain and Developmental Outcomes in Pediatric Sickle Cell Disease (SCD) </w:t>
       </w:r>
     </w:p>
     <w:p>
@@ -5531,7 +5304,6 @@
           <w:sz w:val="20"/>
         </w:rPr>
       </w:pPr>
-      <w:proofErr w:type="spellStart"/>
       <w:r>
         <w:rPr>
           <w:rFonts w:ascii="Times New Roman" w:hAnsi="Times New Roman"/>
@@ -5540,7 +5312,6 @@
         </w:rPr>
         <w:t>Analyzed</w:t>
       </w:r>
-      <w:proofErr w:type="spellEnd"/>
       <w:r>
         <w:rPr>
           <w:rFonts w:ascii="Times New Roman" w:hAnsi="Times New Roman"/>
@@ -5709,25 +5480,7 @@
           <w:bCs/>
           <w:sz w:val="20"/>
         </w:rPr>
-        <w:t xml:space="preserve">Investigated developmental trajectories of executive function in </w:t>
-      </w:r>
-      <w:proofErr w:type="spellStart"/>
-      <w:r>
-        <w:rPr>
-          <w:rFonts w:ascii="Times New Roman" w:hAnsi="Times New Roman"/>
-          <w:bCs/>
-          <w:sz w:val="20"/>
-        </w:rPr>
-        <w:t>pediatric</w:t>
-      </w:r>
-      <w:proofErr w:type="spellEnd"/>
-      <w:r>
-        <w:rPr>
-          <w:rFonts w:ascii="Times New Roman" w:hAnsi="Times New Roman"/>
-          <w:bCs/>
-          <w:sz w:val="20"/>
-        </w:rPr>
-        <w:t xml:space="preserve"> SCD patients </w:t>
+        <w:t xml:space="preserve">Investigated developmental trajectories of executive function in pediatric SCD patients </w:t>
       </w:r>
     </w:p>
     <w:p>
@@ -5744,23 +5497,13 @@
           <w:sz w:val="20"/>
         </w:rPr>
       </w:pPr>
-      <w:proofErr w:type="spellStart"/>
-      <w:r>
-        <w:rPr>
-          <w:rFonts w:ascii="Times New Roman" w:hAnsi="Times New Roman"/>
-          <w:bCs/>
-          <w:sz w:val="20"/>
-        </w:rPr>
-        <w:t>Analyzed</w:t>
-      </w:r>
-      <w:proofErr w:type="spellEnd"/>
-      <w:r>
-        <w:rPr>
-          <w:rFonts w:ascii="Times New Roman" w:hAnsi="Times New Roman"/>
-          <w:bCs/>
-          <w:sz w:val="20"/>
-        </w:rPr>
-        <w:t xml:space="preserve"> caregiver reports to understand how chronic pain impacts cognitive development </w:t>
+      <w:r>
+        <w:rPr>
+          <w:rFonts w:ascii="Times New Roman" w:hAnsi="Times New Roman"/>
+          <w:bCs/>
+          <w:sz w:val="20"/>
+        </w:rPr>
+        <w:t xml:space="preserve">Analyzed caregiver reports to understand how chronic pain impacts cognitive development </w:t>
       </w:r>
     </w:p>
     <w:p>
@@ -6150,6 +5893,101 @@
           <w:color w:val="4F81BD"/>
           <w:sz w:val="20"/>
           <w:lang w:eastAsia="zh-CN"/>
+        </w:rPr>
+      </w:pPr>
+    </w:p>
+    <w:p>
+      <w:pPr>
+        <w:spacing w:line="276" w:lineRule="auto"/>
+        <w:rPr>
+          <w:rFonts w:ascii="Times New Roman" w:hAnsi="Times New Roman"/>
+          <w:sz w:val="20"/>
+        </w:rPr>
+      </w:pPr>
+    </w:p>
+    <w:p>
+      <w:pPr>
+        <w:spacing w:line="276" w:lineRule="auto"/>
+        <w:rPr>
+          <w:rFonts w:ascii="Times New Roman" w:hAnsi="Times New Roman"/>
+          <w:b/>
+          <w:bCs/>
+          <w:sz w:val="20"/>
+        </w:rPr>
+      </w:pPr>
+      <w:r>
+        <w:rPr>
+          <w:rFonts w:ascii="Times New Roman" w:hAnsi="Times New Roman"/>
+          <w:b/>
+          <w:bCs/>
+          <w:sz w:val="20"/>
+        </w:rPr>
+        <w:t>PROFESSIONAL SERVICE</w:t>
+      </w:r>
+    </w:p>
+    <w:p>
+      <w:pPr>
+        <w:spacing w:line="276" w:lineRule="auto"/>
+        <w:rPr>
+          <w:rFonts w:ascii="Times New Roman" w:hAnsi="Times New Roman"/>
+          <w:sz w:val="20"/>
+        </w:rPr>
+      </w:pPr>
+    </w:p>
+    <w:p>
+      <w:pPr>
+        <w:spacing w:line="276" w:lineRule="auto"/>
+        <w:rPr>
+          <w:rFonts w:ascii="Times New Roman" w:hAnsi="Times New Roman"/>
+          <w:sz w:val="20"/>
+        </w:rPr>
+      </w:pPr>
+      <w:r>
+        <w:rPr>
+          <w:rFonts w:ascii="Times New Roman" w:hAnsi="Times New Roman"/>
+          <w:sz w:val="20"/>
+        </w:rPr>
+        <w:t xml:space="preserve">2026 – 2027</w:t>
+      </w:r>
+      <w:r>
+        <w:rPr>
+          <w:rFonts w:ascii="Times New Roman" w:hAnsi="Times New Roman"/>
+          <w:sz w:val="20"/>
+        </w:rPr>
+        <w:tab/>
+      </w:r>
+      <w:r>
+        <w:rPr>
+          <w:rFonts w:ascii="Times New Roman" w:hAnsi="Times New Roman"/>
+          <w:b/>
+          <w:sz w:val="20"/>
+        </w:rPr>
+        <w:t xml:space="preserve">Scientific Committee Member, ISSID 2027</w:t>
+      </w:r>
+    </w:p>
+    <w:p>
+      <w:pPr>
+        <w:spacing w:line="276" w:lineRule="auto"/>
+        <w:ind w:left="2160"/>
+        <w:rPr>
+          <w:rFonts w:ascii="Times New Roman" w:hAnsi="Times New Roman"/>
+          <w:sz w:val="20"/>
+        </w:rPr>
+      </w:pPr>
+      <w:r>
+        <w:rPr>
+          <w:rFonts w:ascii="Times New Roman" w:hAnsi="Times New Roman"/>
+          <w:sz w:val="20"/>
+        </w:rPr>
+        <w:t xml:space="preserve">International Society for the Study of Individual Differences, Durham, UK</w:t>
+      </w:r>
+    </w:p>
+    <w:p>
+      <w:pPr>
+        <w:spacing w:line="276" w:lineRule="auto"/>
+        <w:rPr>
+          <w:rFonts w:ascii="Times New Roman" w:hAnsi="Times New Roman"/>
+          <w:sz w:val="20"/>
         </w:rPr>
       </w:pPr>
     </w:p>
@@ -6415,7 +6253,6 @@
         </w:rPr>
         <w:t xml:space="preserve">Statistics Analyses: </w:t>
       </w:r>
-      <w:proofErr w:type="spellStart"/>
       <w:r>
         <w:rPr>
           <w:rFonts w:ascii="Times New Roman" w:hAnsi="Times New Roman"/>
@@ -6423,7 +6260,6 @@
         </w:rPr>
         <w:t>MPlus</w:t>
       </w:r>
-      <w:proofErr w:type="spellEnd"/>
       <w:r>
         <w:rPr>
           <w:rFonts w:ascii="Times New Roman" w:hAnsi="Times New Roman" w:hint="eastAsia"/>
@@ -6493,7 +6329,6 @@
           <w:rFonts w:ascii="Times New Roman" w:hAnsi="Times New Roman"/>
           <w:sz w:val="20"/>
         </w:rPr>
-        <w:lastRenderedPageBreak/>
         <w:t>Programming: R</w:t>
       </w:r>
       <w:r>
@@ -12416,6 +12251,14 @@
   </w:num>
   <w:numIdMacAtCleanup w:val="8"/>
 </w:numbering>
+</file>
+
+<file path=word/people.xml><?xml version="1.0" encoding="utf-8"?>
+<w15:people xmlns:w15="http://schemas.microsoft.com/office/word/2012/wordml">
+  <w15:person w15:author="Scientific-Writer">
+    <w15:presenceInfo w15:providerId="None" w15:userId="Scientific-Writer"/>
+  </w15:person>
+</w15:people>
 </file>
 
 <file path=word/styles.xml><?xml version="1.0" encoding="utf-8"?>

</xml_diff>